<commit_message>
docs(sustentacion): recalibrar guion oral y cronometria a 12 minutos maximo (3.5 Fernando / 4.5 Frank / 4.0 Joel)
</commit_message>
<xml_diff>
--- a/01_DOCUMENTACION_TECNICA/INFORME_ACADEMICO_APF2_CONSOLIDADO_SIGIR_BCRP.docx
+++ b/01_DOCUMENTACION_TECNICA/INFORME_ACADEMICO_APF2_CONSOLIDADO_SIGIR_BCRP.docx
@@ -1144,13 +1144,7 @@
         <w:spacing w:before="280" w:after="80"/>
       </w:pPr>
       <w:r>
-        <w:rPr>
-          <w:rFonts w:ascii="Calibri" w:hAnsi="Calibri"/>
-          <w:b/>
-          <w:color w:val="003366"/>
-          <w:sz w:val="28"/>
-        </w:rPr>
-        <w:t>5. Sustentación Oral APF2 (Guion de 10 Minutos por Integrante)</w:t>
+        <w:t>5. Sustentación Oral APF2 (Guion de 12 Minutos Máximo)</w:t>
       </w:r>
     </w:p>
     <w:p>
@@ -1158,7 +1152,7 @@
         <w:spacing w:after="120" w:line="276" w:lineRule="auto"/>
       </w:pPr>
       <w:r>
-        <w:t>La presentación ejecutiva se distribuye equitativamente entre los 3 integrantes del equipo, cubriendo los 3 bloques temáticos estratégicos exigidos en la rúbrica para la defensa de 10 minutos:</w:t>
+        <w:t>La presentación ejecutiva se distribuye equitativamente entre los 3 integrantes del equipo, cubriendo los 3 bloques temáticos estratégicos exigidos en la rúbrica para la defensa de 12 minutos máximo:</w:t>
       </w:r>
     </w:p>
     <w:tbl>
@@ -1248,7 +1242,7 @@
             <w:r>
               <w:t>Bloque 1</w:t>
               <w:br/>
-              <w:t>(00:00 - 03:00)</w:t>
+              <w:t>(00:00 - 03:30)</w:t>
             </w:r>
           </w:p>
         </w:tc>
@@ -1292,7 +1286,7 @@
             <w:r>
               <w:t>Bloque 2</w:t>
               <w:br/>
-              <w:t>(03:00 - 07:00)</w:t>
+              <w:t>(03:30 - 08:00)</w:t>
             </w:r>
           </w:p>
         </w:tc>
@@ -1336,7 +1330,7 @@
             <w:r>
               <w:t>Bloque 3</w:t>
               <w:br/>
-              <w:t>(07:00 - 10:00)</w:t>
+              <w:t>(08:00 - 12:00)</w:t>
             </w:r>
           </w:p>
         </w:tc>

</xml_diff>